<commit_message>
Remove 'new' markers from Hypergate FCA consultants list
Co-Authored-By: Claude Opus 5.5 <noreply@anthropic.com>
Claude-Session: https://claude.ai/code/session_01B5RNGs6XtNXKFMQvGGhdBf
</commit_message>
<xml_diff>
--- a/hypergate/Hypergate_FCA_consultants_UK.docx
+++ b/hypergate/Hypergate_FCA_consultants_UK.docx
@@ -29,7 +29,7 @@
           <w:sz w:val="20"/>
           <w:szCs w:val="20"/>
         </w:rPr>
-        <w:t xml:space="preserve">Редакция 2 · 28.09.2026 · 25 фирм (14 из прежнего списка + 11 новых)</w:t>
+        <w:t xml:space="preserve">Редакция 2 · 28.09.2026 · 25 фирм</w:t>
       </w:r>
     </w:p>
     <w:p>
@@ -1021,7 +1021,7 @@
             </w:r>
           </w:p>
           <w:p>
-            <w:hyperlink w:history="1" r:id="rId_f7qdeyxvsd0jzo4iqk1e">
+            <w:hyperlink w:history="1" r:id="rIdwfi6m2pli0ypv0utcjdzz">
               <w:r>
                 <w:rPr>
                   <w:rFonts w:ascii="Arial" w:cs="Arial" w:eastAsia="Arial" w:hAnsi="Arial"/>
@@ -1276,7 +1276,7 @@
             </w:r>
           </w:p>
           <w:p>
-            <w:hyperlink w:history="1" r:id="rIdhax4aeod1pqkbbke59vjc">
+            <w:hyperlink w:history="1" r:id="rIdfljyyuog-d4zfbqe_1usb">
               <w:r>
                 <w:rPr>
                   <w:rFonts w:ascii="Arial" w:cs="Arial" w:eastAsia="Arial" w:hAnsi="Arial"/>
@@ -1534,7 +1534,7 @@
             </w:r>
           </w:p>
           <w:p>
-            <w:hyperlink w:history="1" r:id="rIdthffe1wdn3fceuksdmomp">
+            <w:hyperlink w:history="1" r:id="rIdug9-ribfnqsvwkvvvaodn">
               <w:r>
                 <w:rPr>
                   <w:rFonts w:ascii="Arial" w:cs="Arial" w:eastAsia="Arial" w:hAnsi="Arial"/>
@@ -1787,20 +1787,9 @@
               </w:rPr>
               <w:t xml:space="preserve">Cosegic</w:t>
             </w:r>
-            <w:r>
-              <w:rPr>
-                <w:rFonts w:ascii="Arial" w:cs="Arial" w:eastAsia="Arial" w:hAnsi="Arial"/>
-                <w:b/>
-                <w:bCs/>
-                <w:color w:val="C00000"/>
-                <w:sz w:val="14"/>
-                <w:szCs w:val="14"/>
-              </w:rPr>
-              <w:t xml:space="preserve">  НОВАЯ</w:t>
-            </w:r>
-          </w:p>
-          <w:p>
-            <w:hyperlink w:history="1" r:id="rIdpawzwrdzchlgecyatrfks">
+          </w:p>
+          <w:p>
+            <w:hyperlink w:history="1" r:id="rIdiimckkzyuzqbsnsb4yfhg">
               <w:r>
                 <w:rPr>
                   <w:rFonts w:ascii="Arial" w:cs="Arial" w:eastAsia="Arial" w:hAnsi="Arial"/>
@@ -2058,7 +2047,7 @@
             </w:r>
           </w:p>
           <w:p>
-            <w:hyperlink w:history="1" r:id="rIdeqjtinpytf9lu8vwjlfwa">
+            <w:hyperlink w:history="1" r:id="rIdlzlkhhdsylc0flqz-il98">
               <w:r>
                 <w:rPr>
                   <w:rFonts w:ascii="Arial" w:cs="Arial" w:eastAsia="Arial" w:hAnsi="Arial"/>
@@ -2301,20 +2290,9 @@
               </w:rPr>
               <w:t xml:space="preserve">MEMA Consultants</w:t>
             </w:r>
-            <w:r>
-              <w:rPr>
-                <w:rFonts w:ascii="Arial" w:cs="Arial" w:eastAsia="Arial" w:hAnsi="Arial"/>
-                <w:b/>
-                <w:bCs/>
-                <w:color w:val="C00000"/>
-                <w:sz w:val="14"/>
-                <w:szCs w:val="14"/>
-              </w:rPr>
-              <w:t xml:space="preserve">  НОВАЯ</w:t>
-            </w:r>
-          </w:p>
-          <w:p>
-            <w:hyperlink w:history="1" r:id="rIdflwmm_auzqvamoi8c8kbt">
+          </w:p>
+          <w:p>
+            <w:hyperlink w:history="1" r:id="rId4tdq2t9xqbx1pongwj35v">
               <w:r>
                 <w:rPr>
                   <w:rFonts w:ascii="Arial" w:cs="Arial" w:eastAsia="Arial" w:hAnsi="Arial"/>
@@ -2572,7 +2550,7 @@
             </w:r>
           </w:p>
           <w:p>
-            <w:hyperlink w:history="1" r:id="rIdh1cdo5nzgnwvdiqw77xpe">
+            <w:hyperlink w:history="1" r:id="rIdx_hisbledhrondfzqqaqr">
               <w:r>
                 <w:rPr>
                   <w:rFonts w:ascii="Arial" w:cs="Arial" w:eastAsia="Arial" w:hAnsi="Arial"/>
@@ -2817,7 +2795,7 @@
             </w:r>
           </w:p>
           <w:p>
-            <w:hyperlink w:history="1" r:id="rIdbczuqmjm1-s65z2ufjqgm">
+            <w:hyperlink w:history="1" r:id="rIdsq9s32qrymcch5eewxdp3">
               <w:r>
                 <w:rPr>
                   <w:rFonts w:ascii="Arial" w:cs="Arial" w:eastAsia="Arial" w:hAnsi="Arial"/>
@@ -3063,20 +3041,9 @@
               </w:rPr>
               <w:t xml:space="preserve">Buckingham Capital Consulting</w:t>
             </w:r>
-            <w:r>
-              <w:rPr>
-                <w:rFonts w:ascii="Arial" w:cs="Arial" w:eastAsia="Arial" w:hAnsi="Arial"/>
-                <w:b/>
-                <w:bCs/>
-                <w:color w:val="C00000"/>
-                <w:sz w:val="14"/>
-                <w:szCs w:val="14"/>
-              </w:rPr>
-              <w:t xml:space="preserve">  НОВАЯ</w:t>
-            </w:r>
-          </w:p>
-          <w:p>
-            <w:hyperlink w:history="1" r:id="rIditnqz1ftcvdntycnmkmh8">
+          </w:p>
+          <w:p>
+            <w:hyperlink w:history="1" r:id="rId_jtgy60d2d-_pr0yyokyw">
               <w:r>
                 <w:rPr>
                   <w:rFonts w:ascii="Arial" w:cs="Arial" w:eastAsia="Arial" w:hAnsi="Arial"/>
@@ -3623,20 +3590,9 @@
               </w:rPr>
               <w:t xml:space="preserve">ACA Group</w:t>
             </w:r>
-            <w:r>
-              <w:rPr>
-                <w:rFonts w:ascii="Arial" w:cs="Arial" w:eastAsia="Arial" w:hAnsi="Arial"/>
-                <w:b/>
-                <w:bCs/>
-                <w:color w:val="C00000"/>
-                <w:sz w:val="14"/>
-                <w:szCs w:val="14"/>
-              </w:rPr>
-              <w:t xml:space="preserve">  НОВАЯ</w:t>
-            </w:r>
-          </w:p>
-          <w:p>
-            <w:hyperlink w:history="1" r:id="rId3yaic8ice2ru0lqshy3a2">
+          </w:p>
+          <w:p>
+            <w:hyperlink w:history="1" r:id="rIdhr9hhmrx_m5bmcsx7_w5z">
               <w:r>
                 <w:rPr>
                   <w:rFonts w:ascii="Arial" w:cs="Arial" w:eastAsia="Arial" w:hAnsi="Arial"/>
@@ -3884,7 +3840,7 @@
             </w:r>
           </w:p>
           <w:p>
-            <w:hyperlink w:history="1" r:id="rIdgsoudfxiwifumfwdjumxx">
+            <w:hyperlink w:history="1" r:id="rId61zhfqear5geskbl3a_yo">
               <w:r>
                 <w:rPr>
                   <w:rFonts w:ascii="Arial" w:cs="Arial" w:eastAsia="Arial" w:hAnsi="Arial"/>
@@ -4137,20 +4093,9 @@
               </w:rPr>
               <w:t xml:space="preserve">Kroll</w:t>
             </w:r>
-            <w:r>
-              <w:rPr>
-                <w:rFonts w:ascii="Arial" w:cs="Arial" w:eastAsia="Arial" w:hAnsi="Arial"/>
-                <w:b/>
-                <w:bCs/>
-                <w:color w:val="C00000"/>
-                <w:sz w:val="14"/>
-                <w:szCs w:val="14"/>
-              </w:rPr>
-              <w:t xml:space="preserve">  НОВАЯ</w:t>
-            </w:r>
-          </w:p>
-          <w:p>
-            <w:hyperlink w:history="1" r:id="rIdjgfeiqxykmzncgmizxbvk">
+          </w:p>
+          <w:p>
+            <w:hyperlink w:history="1" r:id="rIdfppxcbnuu0uhcejrxgeaz">
               <w:r>
                 <w:rPr>
                   <w:rFonts w:ascii="Arial" w:cs="Arial" w:eastAsia="Arial" w:hAnsi="Arial"/>
@@ -4396,20 +4341,9 @@
               </w:rPr>
               <w:t xml:space="preserve">PwC UK</w:t>
             </w:r>
-            <w:r>
-              <w:rPr>
-                <w:rFonts w:ascii="Arial" w:cs="Arial" w:eastAsia="Arial" w:hAnsi="Arial"/>
-                <w:b/>
-                <w:bCs/>
-                <w:color w:val="C00000"/>
-                <w:sz w:val="14"/>
-                <w:szCs w:val="14"/>
-              </w:rPr>
-              <w:t xml:space="preserve">  НОВАЯ</w:t>
-            </w:r>
-          </w:p>
-          <w:p>
-            <w:hyperlink w:history="1" r:id="rIds6hrtojdys1p-jbamnj-y">
+          </w:p>
+          <w:p>
+            <w:hyperlink w:history="1" r:id="rId_txc2niwmofuj-gjvyr6w">
               <w:r>
                 <w:rPr>
                   <w:rFonts w:ascii="Arial" w:cs="Arial" w:eastAsia="Arial" w:hAnsi="Arial"/>
@@ -4948,7 +4882,7 @@
             </w:r>
           </w:p>
           <w:p>
-            <w:hyperlink w:history="1" r:id="rId0urh86sdpultdnwmdlufw">
+            <w:hyperlink w:history="1" r:id="rIdc1q4ylxpokpf-egzpmvcb">
               <w:r>
                 <w:rPr>
                   <w:rFonts w:ascii="Arial" w:cs="Arial" w:eastAsia="Arial" w:hAnsi="Arial"/>
@@ -5204,20 +5138,9 @@
               </w:rPr>
               <w:t xml:space="preserve">Keystone Law</w:t>
             </w:r>
-            <w:r>
-              <w:rPr>
-                <w:rFonts w:ascii="Arial" w:cs="Arial" w:eastAsia="Arial" w:hAnsi="Arial"/>
-                <w:b/>
-                <w:bCs/>
-                <w:color w:val="C00000"/>
-                <w:sz w:val="14"/>
-                <w:szCs w:val="14"/>
-              </w:rPr>
-              <w:t xml:space="preserve">  НОВАЯ</w:t>
-            </w:r>
-          </w:p>
-          <w:p>
-            <w:hyperlink w:history="1" r:id="rIdqoggf60bru-_gfgjavb4r">
+          </w:p>
+          <w:p>
+            <w:hyperlink w:history="1" r:id="rIdtsnkt8ysjoivhod_38qwe">
               <w:r>
                 <w:rPr>
                   <w:rFonts w:ascii="Arial" w:cs="Arial" w:eastAsia="Arial" w:hAnsi="Arial"/>
@@ -5460,20 +5383,9 @@
               </w:rPr>
               <w:t xml:space="preserve">gunnercooke</w:t>
             </w:r>
-            <w:r>
-              <w:rPr>
-                <w:rFonts w:ascii="Arial" w:cs="Arial" w:eastAsia="Arial" w:hAnsi="Arial"/>
-                <w:b/>
-                <w:bCs/>
-                <w:color w:val="C00000"/>
-                <w:sz w:val="14"/>
-                <w:szCs w:val="14"/>
-              </w:rPr>
-              <w:t xml:space="preserve">  НОВАЯ</w:t>
-            </w:r>
-          </w:p>
-          <w:p>
-            <w:hyperlink w:history="1" r:id="rIdhrengev9ibttwmsy8qr-q">
+          </w:p>
+          <w:p>
+            <w:hyperlink w:history="1" r:id="rIdbk2fic7iuo4lhznpag_yb">
               <w:r>
                 <w:rPr>
                   <w:rFonts w:ascii="Arial" w:cs="Arial" w:eastAsia="Arial" w:hAnsi="Arial"/>
@@ -5721,7 +5633,7 @@
             </w:r>
           </w:p>
           <w:p>
-            <w:hyperlink w:history="1" r:id="rIdvx4bp6octrqbwcgpf-23c">
+            <w:hyperlink w:history="1" r:id="rIdkkikrvjv3gq4aqnbgsuql">
               <w:r>
                 <w:rPr>
                   <w:rFonts w:ascii="Arial" w:cs="Arial" w:eastAsia="Arial" w:hAnsi="Arial"/>
@@ -6260,7 +6172,7 @@
             </w:r>
           </w:p>
           <w:p>
-            <w:hyperlink w:history="1" r:id="rIdaabby010oha50rnovon40">
+            <w:hyperlink w:history="1" r:id="rIdzuuz36dlpotow_mhvokui">
               <w:r>
                 <w:rPr>
                   <w:rFonts w:ascii="Arial" w:cs="Arial" w:eastAsia="Arial" w:hAnsi="Arial"/>
@@ -6508,7 +6420,7 @@
             </w:r>
           </w:p>
           <w:p>
-            <w:hyperlink w:history="1" r:id="rId2fgeewejeykslfhzaq0yq">
+            <w:hyperlink w:history="1" r:id="rId1nlgflgylkdzgrhcip-1b">
               <w:r>
                 <w:rPr>
                   <w:rFonts w:ascii="Arial" w:cs="Arial" w:eastAsia="Arial" w:hAnsi="Arial"/>
@@ -6753,7 +6665,7 @@
             </w:r>
           </w:p>
           <w:p>
-            <w:hyperlink w:history="1" r:id="rIdks51cxgusdc_-vrmtqsm7">
+            <w:hyperlink w:history="1" r:id="rIdcwlngx4hvvwfwqfoaghgz">
               <w:r>
                 <w:rPr>
                   <w:rFonts w:ascii="Arial" w:cs="Arial" w:eastAsia="Arial" w:hAnsi="Arial"/>
@@ -7001,7 +6913,7 @@
             </w:r>
           </w:p>
           <w:p>
-            <w:hyperlink w:history="1" r:id="rIdxxzf2fpuhviw85nad4ew2">
+            <w:hyperlink w:history="1" r:id="rIdxrepdr-3pem11lk66tcvo">
               <w:r>
                 <w:rPr>
                   <w:rFonts w:ascii="Arial" w:cs="Arial" w:eastAsia="Arial" w:hAnsi="Arial"/>
@@ -7256,7 +7168,7 @@
             </w:r>
           </w:p>
           <w:p>
-            <w:hyperlink w:history="1" r:id="rIdoykattjk4jyfc1byt4cmg">
+            <w:hyperlink w:history="1" r:id="rIddz-e28c8pmrusydmomv5u">
               <w:r>
                 <w:rPr>
                   <w:rFonts w:ascii="Arial" w:cs="Arial" w:eastAsia="Arial" w:hAnsi="Arial"/>
@@ -7512,20 +7424,9 @@
               </w:rPr>
               <w:t xml:space="preserve">Hogan Lovells</w:t>
             </w:r>
-            <w:r>
-              <w:rPr>
-                <w:rFonts w:ascii="Arial" w:cs="Arial" w:eastAsia="Arial" w:hAnsi="Arial"/>
-                <w:b/>
-                <w:bCs/>
-                <w:color w:val="C00000"/>
-                <w:sz w:val="14"/>
-                <w:szCs w:val="14"/>
-              </w:rPr>
-              <w:t xml:space="preserve">  НОВАЯ</w:t>
-            </w:r>
-          </w:p>
-          <w:p>
-            <w:hyperlink w:history="1" r:id="rIdc9eati5nt2zsudd2_xsru">
+          </w:p>
+          <w:p>
+            <w:hyperlink w:history="1" r:id="rIdcf3grcsy0dhpu--l1zzdz">
               <w:r>
                 <w:rPr>
                   <w:rFonts w:ascii="Arial" w:cs="Arial" w:eastAsia="Arial" w:hAnsi="Arial"/>
@@ -7778,20 +7679,9 @@
               </w:rPr>
               <w:t xml:space="preserve">Baker McKenzie</w:t>
             </w:r>
-            <w:r>
-              <w:rPr>
-                <w:rFonts w:ascii="Arial" w:cs="Arial" w:eastAsia="Arial" w:hAnsi="Arial"/>
-                <w:b/>
-                <w:bCs/>
-                <w:color w:val="C00000"/>
-                <w:sz w:val="14"/>
-                <w:szCs w:val="14"/>
-              </w:rPr>
-              <w:t xml:space="preserve">  НОВАЯ</w:t>
-            </w:r>
-          </w:p>
-          <w:p>
-            <w:hyperlink w:history="1" r:id="rIdxmxjckxkjir3f-opmtw6h">
+          </w:p>
+          <w:p>
+            <w:hyperlink w:history="1" r:id="rId5ajuwt3golxhxrrveszn0">
               <w:r>
                 <w:rPr>
                   <w:rFonts w:ascii="Arial" w:cs="Arial" w:eastAsia="Arial" w:hAnsi="Arial"/>
@@ -8047,20 +7937,9 @@
               </w:rPr>
               <w:t xml:space="preserve">Latham &amp; Watkins</w:t>
             </w:r>
-            <w:r>
-              <w:rPr>
-                <w:rFonts w:ascii="Arial" w:cs="Arial" w:eastAsia="Arial" w:hAnsi="Arial"/>
-                <w:b/>
-                <w:bCs/>
-                <w:color w:val="C00000"/>
-                <w:sz w:val="14"/>
-                <w:szCs w:val="14"/>
-              </w:rPr>
-              <w:t xml:space="preserve">  НОВАЯ</w:t>
-            </w:r>
-          </w:p>
-          <w:p>
-            <w:hyperlink w:history="1" r:id="rIdsgeydmkm1esk1jpqae_8m">
+          </w:p>
+          <w:p>
+            <w:hyperlink w:history="1" r:id="rIddt6qecmo5kijjchuxr3lp">
               <w:r>
                 <w:rPr>
                   <w:rFonts w:ascii="Arial" w:cs="Arial" w:eastAsia="Arial" w:hAnsi="Arial"/>
@@ -8375,7 +8254,7 @@
           <w:sz w:val="16"/>
           <w:szCs w:val="16"/>
         </w:rPr>
-        <w:t xml:space="preserve">Контакты собраны из открытых источников (сайты фирм, их публикации, каталоги). Перед отправкой запроса проверьте их актуальность на сайтах. Метка «НОВАЯ» — фирма добавлена в этой редакции.</w:t>
+        <w:t xml:space="preserve">Контакты собраны из открытых источников (сайты фирм, их публикации, каталоги). Перед отправкой запроса проверьте их актуальность на сайтах.</w:t>
       </w:r>
     </w:p>
     <w:sectPr>

</xml_diff>